<commit_message>
action-list: mirror 1.1.0 from the private source
Files copied from 04_free/action-list, byte-identical. Gates run before staging:
  strip_audit                  exit 0  VERDICT: PASS
  skill_audit                  exit 0  VERDICT: PASS
  pack_skill                   exit 0  VERDICT: PASS
  portability_gate (archive)   exit 0  VERDICT PASS   BLOCK 0 / REVIEW 0 / WARN 0   exit 0
  shakedown (headless)         PASS
  shakedown (web)              PASS

Staged by _tools/publish_mirror.py. No history is carried from the
private repository (Decision 67).
</commit_message>
<xml_diff>
--- a/examples/roastery-weekly/ROAST_OPS_Roastery_Operations_Weekly_ACTIONS_2026-04-23.docx
+++ b/examples/roastery-weekly/ROAST_OPS_Roastery_Operations_Weekly_ACTIONS_2026-04-23.docx
@@ -506,7 +506,7 @@
                 <w:sz w:val="18"/>
                 <w:szCs w:val="18"/>
               </w:rPr>
-              <w:t xml:space="preserve">Friday April 25</w:t>
+              <w:t xml:space="preserve">Friday April 24</w:t>
             </w:r>
           </w:p>
         </w:tc>
@@ -554,7 +554,7 @@
                 <w:sz w:val="18"/>
                 <w:szCs w:val="18"/>
               </w:rPr>
-              <w:t xml:space="preserve">"Dana will place the reorder with the importer by Friday April 25"</w:t>
+              <w:t xml:space="preserve">"Dana will place the reorder with the importer by Friday April 24"</w:t>
             </w:r>
           </w:p>
         </w:tc>

</xml_diff>